<commit_message>
docs(begroting): toelichting beknopter H1, PJM-tarief expliciet, functie-taal ipv modelrollen, 3sides-kader op post 410
</commit_message>
<xml_diff>
--- a/Begroting/Toelichting begroting 2027 - Klant in zicht.docx
+++ b/Begroting/Toelichting begroting 2027 - Klant in zicht.docx
@@ -471,7 +471,7 @@
           <w:sz w:val="22"/>
           <w:szCs w:val="22"/>
         </w:rPr>
-        <w:t xml:space="preserve"> (€ 261.316 tegen Cito-kostprijstarieven). Alle waarden zijn scriptmatig herleid uit de actuele programmadata (live sessie, versie 2594) — niets is handmatig overgetypt of geschat.</w:t>
+        <w:t xml:space="preserve"> (€ 261.316 tegen Cito-kostprijstarieven). Alle waarden zijn één-op-één herleid uit de actuele programmadata — niets is handmatig overgetypt of geschat.</w:t>
       </w:r>
     </w:p>
     <w:p>
@@ -486,7 +486,7 @@
           <w:bCs/>
           <w:color w:val="003366"/>
         </w:rPr>
-        <w:t xml:space="preserve">1. Scenario en bronnen</w:t>
+        <w:t xml:space="preserve">1. Uitgangspunt</w:t>
       </w:r>
     </w:p>
     <w:p>
@@ -500,7 +500,7 @@
           <w:sz w:val="22"/>
           <w:szCs w:val="22"/>
         </w:rPr>
-        <w:t xml:space="preserve">Het “20%-scenario” is het </w:t>
+        <w:t xml:space="preserve">Deze begroting is de </w:t>
       </w:r>
       <w:r>
         <w:rPr>
@@ -511,16 +511,16 @@
           <w:sz w:val="22"/>
           <w:szCs w:val="22"/>
         </w:rPr>
-        <w:t xml:space="preserve">Plus20-scenario</w:t>
-      </w:r>
-      <w:r>
-        <w:rPr>
-          <w:rFonts w:ascii="Calibri" w:cs="Calibri" w:eastAsia="Calibri" w:hAnsi="Calibri"/>
-          <w:color w:val="1F2937"/>
-          <w:sz w:val="22"/>
-          <w:szCs w:val="22"/>
-        </w:rPr>
-        <w:t xml:space="preserve"> uit het programma-begrotingsadvies: 20% méér jaarbudget dan het huidige plafond (€ 250.000 × 1,2 = € 300.000 vanaf 2027; 2026 blijft hard € 250.000), waardoor het programma in 5 jaar in plaats van 7 wordt gerealiseerd. Plus20 is het geadviseerde scenario: gefaseerd tempo met beheersbare jaarlast en gespreide CRM-bouw.</w:t>
+        <w:t xml:space="preserve">jaarschijf 2027</w:t>
+      </w:r>
+      <w:r>
+        <w:rPr>
+          <w:rFonts w:ascii="Calibri" w:cs="Calibri" w:eastAsia="Calibri" w:hAnsi="Calibri"/>
+          <w:color w:val="1F2937"/>
+          <w:sz w:val="22"/>
+          <w:szCs w:val="22"/>
+        </w:rPr>
+        <w:t xml:space="preserve"> van het programma Klant in Beeld, volgens het gekozen 20%-scenario (jaarplafond € 300.000 vanaf 2027). Van het vijfjarige programma (2026–2030) is hier uitsluitend het jaar 2027 opgenomen: € 301.500 externe kosten en 3.484 interne uren.</w:t>
       </w:r>
     </w:p>
     <w:p>
@@ -530,370 +530,13 @@
       <w:r>
         <w:rPr>
           <w:rFonts w:ascii="Calibri" w:cs="Calibri" w:eastAsia="Calibri" w:hAnsi="Calibri"/>
-          <w:b/>
-          <w:bCs/>
-          <w:color w:val="1F2937"/>
-          <w:sz w:val="22"/>
-          <w:szCs w:val="22"/>
-        </w:rPr>
-        <w:t xml:space="preserve">Alleen jaarschijf 2027. </w:t>
-      </w:r>
-      <w:r>
-        <w:rPr>
-          <w:rFonts w:ascii="Calibri" w:cs="Calibri" w:eastAsia="Calibri" w:hAnsi="Calibri"/>
-          <w:color w:val="1F2937"/>
-          <w:sz w:val="22"/>
-          <w:szCs w:val="22"/>
-        </w:rPr>
-        <w:t xml:space="preserve">Het volledige scenario omvat 8.166 interne uren en € 1.459.500 over vijf jaar; deze begroting bevat uitsluitend de 2027-schijf (3.484 uur, € 301.500).</w:t>
+          <w:color w:val="1F2937"/>
+          <w:sz w:val="22"/>
+          <w:szCs w:val="22"/>
+        </w:rPr>
+        <w:t xml:space="preserve">Alle waarden zijn één-op-één herleid uit de actuele programmadata (stand 9 juli 2026; lokale kopie: BRON-LIVE-SESSIE-STAP4-2026-08-11.json). Tarieven en bedragen zijn onderbouwd met marktbenchmarks (o.a. Berenschot, Microsoft Pricing, Gartner).</w:t>
       </w:r>
     </w:p>
-    <w:tbl>
-      <w:tblPr>
-        <w:tblW w:type="pct" w:w="100%"/>
-        <w:tblBorders>
-          <w:top w:val="single" w:color="auto" w:sz="4"/>
-          <w:left w:val="single" w:color="auto" w:sz="4"/>
-          <w:bottom w:val="single" w:color="auto" w:sz="4"/>
-          <w:right w:val="single" w:color="auto" w:sz="4"/>
-          <w:insideH w:val="single" w:color="auto" w:sz="4"/>
-          <w:insideV w:val="single" w:color="auto" w:sz="4"/>
-        </w:tblBorders>
-      </w:tblPr>
-      <w:tblGrid>
-        <w:gridCol w:w="100"/>
-        <w:gridCol w:w="100"/>
-      </w:tblGrid>
-      <w:tr>
-        <w:trPr>
-          <w:tblHeader/>
-        </w:trPr>
-        <w:tc>
-          <w:tcPr>
-            <w:tcW w:type="pct" w:w="45%"/>
-            <w:tcBorders>
-              <w:top w:val="single" w:color="D1D5DB" w:sz="1"/>
-              <w:left w:val="single" w:color="D1D5DB" w:sz="1"/>
-              <w:bottom w:val="single" w:color="D1D5DB" w:sz="1"/>
-              <w:right w:val="single" w:color="D1D5DB" w:sz="1"/>
-            </w:tcBorders>
-            <w:shd w:fill="E8EDF3" w:val="clear"/>
-            <w:tcMar>
-              <w:top w:type="dxa" w:w="60"/>
-              <w:left w:type="dxa" w:w="100"/>
-              <w:bottom w:type="dxa" w:w="60"/>
-              <w:right w:type="dxa" w:w="100"/>
-            </w:tcMar>
-          </w:tcPr>
-          <w:p>
-            <w:pPr>
-              <w:jc w:val="left"/>
-            </w:pPr>
-            <w:r>
-              <w:rPr>
-                <w:rFonts w:ascii="Calibri" w:cs="Calibri" w:eastAsia="Calibri" w:hAnsi="Calibri"/>
-                <w:b/>
-                <w:bCs/>
-                <w:color w:val="003366"/>
-                <w:sz w:val="19"/>
-                <w:szCs w:val="19"/>
-              </w:rPr>
-              <w:t xml:space="preserve">Bron</w:t>
-            </w:r>
-          </w:p>
-        </w:tc>
-        <w:tc>
-          <w:tcPr>
-            <w:tcW w:type="pct" w:w="55%"/>
-            <w:tcBorders>
-              <w:top w:val="single" w:color="D1D5DB" w:sz="1"/>
-              <w:left w:val="single" w:color="D1D5DB" w:sz="1"/>
-              <w:bottom w:val="single" w:color="D1D5DB" w:sz="1"/>
-              <w:right w:val="single" w:color="D1D5DB" w:sz="1"/>
-            </w:tcBorders>
-            <w:shd w:fill="E8EDF3" w:val="clear"/>
-            <w:tcMar>
-              <w:top w:type="dxa" w:w="60"/>
-              <w:left w:type="dxa" w:w="100"/>
-              <w:bottom w:type="dxa" w:w="60"/>
-              <w:right w:type="dxa" w:w="100"/>
-            </w:tcMar>
-          </w:tcPr>
-          <w:p>
-            <w:pPr>
-              <w:jc w:val="left"/>
-            </w:pPr>
-            <w:r>
-              <w:rPr>
-                <w:rFonts w:ascii="Calibri" w:cs="Calibri" w:eastAsia="Calibri" w:hAnsi="Calibri"/>
-                <w:b/>
-                <w:bCs/>
-                <w:color w:val="003366"/>
-                <w:sz w:val="19"/>
-                <w:szCs w:val="19"/>
-              </w:rPr>
-              <w:t xml:space="preserve">Gebruikt voor</w:t>
-            </w:r>
-          </w:p>
-        </w:tc>
-      </w:tr>
-      <w:tr>
-        <w:tc>
-          <w:tcPr>
-            <w:tcW w:type="pct" w:w="45%"/>
-            <w:tcBorders>
-              <w:top w:val="single" w:color="D1D5DB" w:sz="1"/>
-              <w:left w:val="single" w:color="D1D5DB" w:sz="1"/>
-              <w:bottom w:val="single" w:color="D1D5DB" w:sz="1"/>
-              <w:right w:val="single" w:color="D1D5DB" w:sz="1"/>
-            </w:tcBorders>
-            <w:tcMar>
-              <w:top w:type="dxa" w:w="60"/>
-              <w:left w:type="dxa" w:w="100"/>
-              <w:bottom w:type="dxa" w:w="60"/>
-              <w:right w:type="dxa" w:w="100"/>
-            </w:tcMar>
-          </w:tcPr>
-          <w:p>
-            <w:pPr>
-              <w:jc w:val="left"/>
-            </w:pPr>
-            <w:r>
-              <w:rPr>
-                <w:rFonts w:ascii="Calibri" w:cs="Calibri" w:eastAsia="Calibri" w:hAnsi="Calibri"/>
-                <w:color w:val="1F2937"/>
-                <w:sz w:val="20"/>
-                <w:szCs w:val="20"/>
-              </w:rPr>
-              <w:t xml:space="preserve">Live programmadata (sessie d8b97442, v2594, 9 juli 2026) — lokale kopie: BRON-LIVE-SESSIE-STAP4-2026-08-11.json</w:t>
-            </w:r>
-          </w:p>
-        </w:tc>
-        <w:tc>
-          <w:tcPr>
-            <w:tcW w:type="pct" w:w="55%"/>
-            <w:tcBorders>
-              <w:top w:val="single" w:color="D1D5DB" w:sz="1"/>
-              <w:left w:val="single" w:color="D1D5DB" w:sz="1"/>
-              <w:bottom w:val="single" w:color="D1D5DB" w:sz="1"/>
-              <w:right w:val="single" w:color="D1D5DB" w:sz="1"/>
-            </w:tcBorders>
-            <w:tcMar>
-              <w:top w:type="dxa" w:w="60"/>
-              <w:left w:type="dxa" w:w="100"/>
-              <w:bottom w:type="dxa" w:w="60"/>
-              <w:right w:type="dxa" w:w="100"/>
-            </w:tcMar>
-          </w:tcPr>
-          <w:p>
-            <w:pPr>
-              <w:jc w:val="left"/>
-            </w:pPr>
-            <w:r>
-              <w:rPr>
-                <w:rFonts w:ascii="Calibri" w:cs="Calibri" w:eastAsia="Calibri" w:hAnsi="Calibri"/>
-                <w:color w:val="1F2937"/>
-                <w:sz w:val="20"/>
-                <w:szCs w:val="20"/>
-              </w:rPr>
-              <w:t xml:space="preserve">Interne uren 2027 per rol · out-of-pocket 2027 per inspanning</w:t>
-            </w:r>
-          </w:p>
-        </w:tc>
-      </w:tr>
-      <w:tr>
-        <w:tc>
-          <w:tcPr>
-            <w:tcW w:type="pct" w:w="45%"/>
-            <w:tcBorders>
-              <w:top w:val="single" w:color="D1D5DB" w:sz="1"/>
-              <w:left w:val="single" w:color="D1D5DB" w:sz="1"/>
-              <w:bottom w:val="single" w:color="D1D5DB" w:sz="1"/>
-              <w:right w:val="single" w:color="D1D5DB" w:sz="1"/>
-            </w:tcBorders>
-            <w:tcMar>
-              <w:top w:type="dxa" w:w="60"/>
-              <w:left w:type="dxa" w:w="100"/>
-              <w:bottom w:type="dxa" w:w="60"/>
-              <w:right w:type="dxa" w:w="100"/>
-            </w:tcMar>
-          </w:tcPr>
-          <w:p>
-            <w:pPr>
-              <w:jc w:val="left"/>
-            </w:pPr>
-            <w:r>
-              <w:rPr>
-                <w:rFonts w:ascii="Calibri" w:cs="Calibri" w:eastAsia="Calibri" w:hAnsi="Calibri"/>
-                <w:color w:val="1F2937"/>
-                <w:sz w:val="20"/>
-                <w:szCs w:val="20"/>
-              </w:rPr>
-              <w:t xml:space="preserve">Componentonderbouwing CRM (known-breakdowns)</w:t>
-            </w:r>
-          </w:p>
-        </w:tc>
-        <w:tc>
-          <w:tcPr>
-            <w:tcW w:type="pct" w:w="55%"/>
-            <w:tcBorders>
-              <w:top w:val="single" w:color="D1D5DB" w:sz="1"/>
-              <w:left w:val="single" w:color="D1D5DB" w:sz="1"/>
-              <w:bottom w:val="single" w:color="D1D5DB" w:sz="1"/>
-              <w:right w:val="single" w:color="D1D5DB" w:sz="1"/>
-            </w:tcBorders>
-            <w:tcMar>
-              <w:top w:type="dxa" w:w="60"/>
-              <w:left w:type="dxa" w:w="100"/>
-              <w:bottom w:type="dxa" w:w="60"/>
-              <w:right w:type="dxa" w:w="100"/>
-            </w:tcMar>
-          </w:tcPr>
-          <w:p>
-            <w:pPr>
-              <w:jc w:val="left"/>
-            </w:pPr>
-            <w:r>
-              <w:rPr>
-                <w:rFonts w:ascii="Calibri" w:cs="Calibri" w:eastAsia="Calibri" w:hAnsi="Calibri"/>
-                <w:color w:val="1F2937"/>
-                <w:sz w:val="20"/>
-                <w:szCs w:val="20"/>
-              </w:rPr>
-              <w:t xml:space="preserve">Splitsing CRM-bedrag in licenties vs. diensten</w:t>
-            </w:r>
-          </w:p>
-        </w:tc>
-      </w:tr>
-      <w:tr>
-        <w:tc>
-          <w:tcPr>
-            <w:tcW w:type="pct" w:w="45%"/>
-            <w:tcBorders>
-              <w:top w:val="single" w:color="D1D5DB" w:sz="1"/>
-              <w:left w:val="single" w:color="D1D5DB" w:sz="1"/>
-              <w:bottom w:val="single" w:color="D1D5DB" w:sz="1"/>
-              <w:right w:val="single" w:color="D1D5DB" w:sz="1"/>
-            </w:tcBorders>
-            <w:tcMar>
-              <w:top w:type="dxa" w:w="60"/>
-              <w:left w:type="dxa" w:w="100"/>
-              <w:bottom w:type="dxa" w:w="60"/>
-              <w:right w:type="dxa" w:w="100"/>
-            </w:tcMar>
-          </w:tcPr>
-          <w:p>
-            <w:pPr>
-              <w:jc w:val="left"/>
-            </w:pPr>
-            <w:r>
-              <w:rPr>
-                <w:rFonts w:ascii="Calibri" w:cs="Calibri" w:eastAsia="Calibri" w:hAnsi="Calibri"/>
-                <w:color w:val="1F2937"/>
-                <w:sz w:val="20"/>
-                <w:szCs w:val="20"/>
-              </w:rPr>
-              <w:t xml:space="preserve">Audit fasering out-of-pocket · reconciliatie Plus20</w:t>
-            </w:r>
-          </w:p>
-        </w:tc>
-        <w:tc>
-          <w:tcPr>
-            <w:tcW w:type="pct" w:w="55%"/>
-            <w:tcBorders>
-              <w:top w:val="single" w:color="D1D5DB" w:sz="1"/>
-              <w:left w:val="single" w:color="D1D5DB" w:sz="1"/>
-              <w:bottom w:val="single" w:color="D1D5DB" w:sz="1"/>
-              <w:right w:val="single" w:color="D1D5DB" w:sz="1"/>
-            </w:tcBorders>
-            <w:tcMar>
-              <w:top w:type="dxa" w:w="60"/>
-              <w:left w:type="dxa" w:w="100"/>
-              <w:bottom w:type="dxa" w:w="60"/>
-              <w:right w:type="dxa" w:w="100"/>
-            </w:tcMar>
-          </w:tcPr>
-          <w:p>
-            <w:pPr>
-              <w:jc w:val="left"/>
-            </w:pPr>
-            <w:r>
-              <w:rPr>
-                <w:rFonts w:ascii="Calibri" w:cs="Calibri" w:eastAsia="Calibri" w:hAnsi="Calibri"/>
-                <w:color w:val="1F2937"/>
-                <w:sz w:val="20"/>
-                <w:szCs w:val="20"/>
-              </w:rPr>
-              <w:t xml:space="preserve">Kruiscontrole jaarbedragen</w:t>
-            </w:r>
-          </w:p>
-        </w:tc>
-      </w:tr>
-      <w:tr>
-        <w:tc>
-          <w:tcPr>
-            <w:tcW w:type="pct" w:w="45%"/>
-            <w:tcBorders>
-              <w:top w:val="single" w:color="D1D5DB" w:sz="1"/>
-              <w:left w:val="single" w:color="D1D5DB" w:sz="1"/>
-              <w:bottom w:val="single" w:color="D1D5DB" w:sz="1"/>
-              <w:right w:val="single" w:color="D1D5DB" w:sz="1"/>
-            </w:tcBorders>
-            <w:tcMar>
-              <w:top w:type="dxa" w:w="60"/>
-              <w:left w:type="dxa" w:w="100"/>
-              <w:bottom w:type="dxa" w:w="60"/>
-              <w:right w:type="dxa" w:w="100"/>
-            </w:tcMar>
-          </w:tcPr>
-          <w:p>
-            <w:pPr>
-              <w:jc w:val="left"/>
-            </w:pPr>
-            <w:r>
-              <w:rPr>
-                <w:rFonts w:ascii="Calibri" w:cs="Calibri" w:eastAsia="Calibri" w:hAnsi="Calibri"/>
-                <w:color w:val="1F2937"/>
-                <w:sz w:val="20"/>
-                <w:szCs w:val="20"/>
-              </w:rPr>
-              <w:t xml:space="preserve">Plausibiliteitstoets Plus20</w:t>
-            </w:r>
-          </w:p>
-        </w:tc>
-        <w:tc>
-          <w:tcPr>
-            <w:tcW w:type="pct" w:w="55%"/>
-            <w:tcBorders>
-              <w:top w:val="single" w:color="D1D5DB" w:sz="1"/>
-              <w:left w:val="single" w:color="D1D5DB" w:sz="1"/>
-              <w:bottom w:val="single" w:color="D1D5DB" w:sz="1"/>
-              <w:right w:val="single" w:color="D1D5DB" w:sz="1"/>
-            </w:tcBorders>
-            <w:tcMar>
-              <w:top w:type="dxa" w:w="60"/>
-              <w:left w:type="dxa" w:w="100"/>
-              <w:bottom w:type="dxa" w:w="60"/>
-              <w:right w:type="dxa" w:w="100"/>
-            </w:tcMar>
-          </w:tcPr>
-          <w:p>
-            <w:pPr>
-              <w:jc w:val="left"/>
-            </w:pPr>
-            <w:r>
-              <w:rPr>
-                <w:rFonts w:ascii="Calibri" w:cs="Calibri" w:eastAsia="Calibri" w:hAnsi="Calibri"/>
-                <w:color w:val="1F2937"/>
-                <w:sz w:val="20"/>
-                <w:szCs w:val="20"/>
-              </w:rPr>
-              <w:t xml:space="preserve">Marktbenchmarks tarieven (Berenschot, Microsoft Pricing, Gartner/Forrester, NIP/NOLOC)</w:t>
-            </w:r>
-          </w:p>
-        </w:tc>
-      </w:tr>
-    </w:tbl>
     <w:p>
       <w:pPr>
         <w:pStyle w:val="Heading1"/>
@@ -1950,7 +1593,27 @@
           <w:sz w:val="22"/>
           <w:szCs w:val="22"/>
         </w:rPr>
-        <w:t xml:space="preserve">leiderschapsprogramma outside-in € 30.000 (externe begeleider, coaching 9 leidinggevenden, leerkringen), uniforme klantinformatieprocessen € 28.000 (externe procesbegeleiding, werksessies, pilots in Smartprocess) en de programma-brede post onvoorzien € 7.000. Het sjabloon kent geen aparte post onvoorzien; de buffer staat bij 410 omdat de belangrijkste risico’s in de externe advies-/implementatiesfeer liggen. Bij vrijval valt dit bedrag terug aan het programmabudget.</w:t>
+        <w:t xml:space="preserve">leiderschapsprogramma outside-in € 30.000 (externe begeleider, coaching 9 leidinggevenden, leerkringen), uniforme klantinformatieprocessen € 28.000 (externe procesbegeleiding, werksessies, pilots in Smartprocess) en de programma-brede post onvoorzien € 7.000. Het sjabloon kent geen aparte post onvoorzien; de buffer staat bij 410 omdat de belangrijkste risico’s in de externe advies-/implementatiesfeer liggen. Bij vrijval valt dit bedrag terug aan het programmabudget. </w:t>
+      </w:r>
+      <w:r>
+        <w:rPr>
+          <w:rFonts w:ascii="Calibri" w:cs="Calibri" w:eastAsia="Calibri" w:hAnsi="Calibri"/>
+          <w:b/>
+          <w:bCs/>
+          <w:color w:val="1F2937"/>
+          <w:sz w:val="22"/>
+          <w:szCs w:val="22"/>
+        </w:rPr>
+        <w:t xml:space="preserve">Op deze post landt ook de rol van 3sides</w:t>
+      </w:r>
+      <w:r>
+        <w:rPr>
+          <w:rFonts w:ascii="Calibri" w:cs="Calibri" w:eastAsia="Calibri" w:hAnsi="Calibri"/>
+          <w:color w:val="1F2937"/>
+          <w:sz w:val="22"/>
+          <w:szCs w:val="22"/>
+        </w:rPr>
+        <w:t xml:space="preserve"> als strategische- en executiepartner (begeleiding, borging, regie op met name processen en data): de begeleidingscomponenten hierboven vormen daarvoor het kader. De definitieve 3sides-urenraming 2027 (6 maanden, uren aanpasbaar op basis van de 2026-ervaring) volgt als offerte; valt die hoger uit dan het kader, dan is de post onvoorzien het eerste vangnet en vraagt het meerdere om herijking van de programmaraming.</w:t>
       </w:r>
     </w:p>
     <w:p>
@@ -2050,7 +1713,7 @@
           <w:bCs/>
           <w:color w:val="003366"/>
         </w:rPr>
-        <w:t xml:space="preserve">Mappingregels programmarollen → Cito-rolcodes</w:t>
+        <w:t xml:space="preserve">Van programmafunctie naar Cito-rolcode</w:t>
       </w:r>
     </w:p>
     <w:p>
@@ -2064,7 +1727,7 @@
           <w:sz w:val="22"/>
           <w:szCs w:val="22"/>
         </w:rPr>
-        <w:t xml:space="preserve">Het programmamodel raamt uren op rolregels (functie × domein); het Cito-sjabloon kent 24 rolcodes. Mapping volgens vier vaste regels, integraal toegepast:</w:t>
+        <w:t xml:space="preserve">De urenraming van het programma is opgebouwd per functie (bijvoorbeeld accountmanager C, klantenservice C, sectormanager PO) per domein. Het Cito-sjabloon kent 24 rolcodes; elke functie is volgens vier vaste regels aan één rolcode toegewezen:</w:t>
       </w:r>
     </w:p>
     <w:p>
@@ -2090,16 +1753,16 @@
           <w:sz w:val="22"/>
           <w:szCs w:val="22"/>
         </w:rPr>
-        <w:t xml:space="preserve">1. Uitvoerende rollen </w:t>
-      </w:r>
-      <w:r>
-        <w:rPr>
-          <w:rFonts w:ascii="Calibri" w:cs="Calibri" w:eastAsia="Calibri" w:hAnsi="Calibri"/>
-          <w:color w:val="1F2937"/>
-          <w:sz w:val="22"/>
-          <w:szCs w:val="22"/>
-        </w:rPr>
-        <w:t xml:space="preserve">→ hun directe Cito-code (accountmanager → AM, trainer → TRA, productmanager → PDM, productowner → PDO).</w:t>
+        <w:t xml:space="preserve">1. Uitvoerende functies </w:t>
+      </w:r>
+      <w:r>
+        <w:rPr>
+          <w:rFonts w:ascii="Calibri" w:cs="Calibri" w:eastAsia="Calibri" w:hAnsi="Calibri"/>
+          <w:color w:val="1F2937"/>
+          <w:sz w:val="22"/>
+          <w:szCs w:val="22"/>
+        </w:rPr>
+        <w:t xml:space="preserve">→ hun directe Cito-code (accountmanager → AM € 81/u, trainer → TRA € 87/u, productmanager → PDM € 95/u, productowner → PDO € 87/u).</w:t>
       </w:r>
     </w:p>
     <w:p>
@@ -2125,16 +1788,16 @@
           <w:sz w:val="22"/>
           <w:szCs w:val="22"/>
         </w:rPr>
-        <w:t xml:space="preserve">2. Klantenservice- en binnendienstrollen </w:t>
-      </w:r>
-      <w:r>
-        <w:rPr>
-          <w:rFonts w:ascii="Calibri" w:cs="Calibri" w:eastAsia="Calibri" w:hAnsi="Calibri"/>
-          <w:color w:val="1F2937"/>
-          <w:sz w:val="22"/>
-          <w:szCs w:val="22"/>
-        </w:rPr>
-        <w:t xml:space="preserve">→ MCB (Medewerker Commerciële Binnendienst) — er is geen aparte klantenservice-code; MCB is hetzelfde klantcontact-cluster en met € 56/u een conservatief tarief.</w:t>
+        <w:t xml:space="preserve">2. Klantenservice- en binnendienstfuncties </w:t>
+      </w:r>
+      <w:r>
+        <w:rPr>
+          <w:rFonts w:ascii="Calibri" w:cs="Calibri" w:eastAsia="Calibri" w:hAnsi="Calibri"/>
+          <w:color w:val="1F2937"/>
+          <w:sz w:val="22"/>
+          <w:szCs w:val="22"/>
+        </w:rPr>
+        <w:t xml:space="preserve">→ MCB (Medewerker Commerciële Binnendienst, € 56/u) — er is geen aparte klantenservice-code; MCB is hetzelfde klantcontact-cluster.</w:t>
       </w:r>
     </w:p>
     <w:p>
@@ -2160,16 +1823,36 @@
           <w:sz w:val="22"/>
           <w:szCs w:val="22"/>
         </w:rPr>
-        <w:t xml:space="preserve">3. Alle leidinggevende rollen </w:t>
-      </w:r>
-      <w:r>
-        <w:rPr>
-          <w:rFonts w:ascii="Calibri" w:cs="Calibri" w:eastAsia="Calibri" w:hAnsi="Calibri"/>
-          <w:color w:val="1F2937"/>
-          <w:sz w:val="22"/>
-          <w:szCs w:val="22"/>
-        </w:rPr>
-        <w:t xml:space="preserve">(sectormanagers, directeur, managers, teamleiders én de vier inspanningsleiders) → PJM (Projectmanager) — programma-/projectleidende inzet, tarief het dichtst bij het leiderstarief van het model.</w:t>
+        <w:t xml:space="preserve">3. Alle leidinggevende functies </w:t>
+      </w:r>
+      <w:r>
+        <w:rPr>
+          <w:rFonts w:ascii="Calibri" w:cs="Calibri" w:eastAsia="Calibri" w:hAnsi="Calibri"/>
+          <w:color w:val="1F2937"/>
+          <w:sz w:val="22"/>
+          <w:szCs w:val="22"/>
+        </w:rPr>
+        <w:t xml:space="preserve">(sectormanagers, directeur, managers, teamleiders én de vier inspanningsleiders) → PJM (Projectmanager), tegen het </w:t>
+      </w:r>
+      <w:r>
+        <w:rPr>
+          <w:rFonts w:ascii="Calibri" w:cs="Calibri" w:eastAsia="Calibri" w:hAnsi="Calibri"/>
+          <w:b/>
+          <w:bCs/>
+          <w:color w:val="1F2937"/>
+          <w:sz w:val="22"/>
+          <w:szCs w:val="22"/>
+        </w:rPr>
+        <w:t xml:space="preserve">PJM-tarief van € 90/u</w:t>
+      </w:r>
+      <w:r>
+        <w:rPr>
+          <w:rFonts w:ascii="Calibri" w:cs="Calibri" w:eastAsia="Calibri" w:hAnsi="Calibri"/>
+          <w:color w:val="1F2937"/>
+          <w:sz w:val="22"/>
+          <w:szCs w:val="22"/>
+        </w:rPr>
+        <w:t xml:space="preserve">. Dit is het Cito-tarief dat het dichtst ligt bij wat het programma voor leidinggevenden rekende (€ 82/u).</w:t>
       </w:r>
     </w:p>
     <w:p>
@@ -2195,16 +1878,16 @@
           <w:sz w:val="22"/>
           <w:szCs w:val="22"/>
         </w:rPr>
-        <w:t xml:space="preserve">4. HR-rollen: </w:t>
-      </w:r>
-      <w:r>
-        <w:rPr>
-          <w:rFonts w:ascii="Calibri" w:cs="Calibri" w:eastAsia="Calibri" w:hAnsi="Calibri"/>
-          <w:color w:val="1F2937"/>
-          <w:sz w:val="22"/>
-          <w:szCs w:val="22"/>
-        </w:rPr>
-        <w:t xml:space="preserve">curriculum-/opleidingswerk → TRA; HRM-instrumentarium (360°-feedback, functioneringscyclus) → PRO (procesconsultant).</w:t>
+        <w:t xml:space="preserve">4. HR-functies: </w:t>
+      </w:r>
+      <w:r>
+        <w:rPr>
+          <w:rFonts w:ascii="Calibri" w:cs="Calibri" w:eastAsia="Calibri" w:hAnsi="Calibri"/>
+          <w:color w:val="1F2937"/>
+          <w:sz w:val="22"/>
+          <w:szCs w:val="22"/>
+        </w:rPr>
+        <w:t xml:space="preserve">curriculum-/opleidingswerk → TRA (€ 87/u); HRM-instrumentarium zoals 360°-feedback en functioneringscyclus → PRO (procesconsultant, € 56/u).</w:t>
       </w:r>
     </w:p>
     <w:p>
@@ -4039,7 +3722,7 @@
           <w:sz w:val="22"/>
           <w:szCs w:val="22"/>
         </w:rPr>
-        <w:t xml:space="preserve">MCB (1.050 u) en PJM (1.030 u) zijn aggregaties van respectievelijk 8 en 15 modelrollen — geen twee individuele medewerkers met een extreem urenbeslag. Het regelniveau is volledig reproduceerbaar uit het bronbestand. Inleen (F55–F65) is bewust leeg: alle externe inzet is als out-of-pocket geraamd en staat op de onkostenposten.</w:t>
+        <w:t xml:space="preserve">MCB (1.050 u) en PJM (1.030 u) zijn optellingen van meerdere functies — MCB bundelt 8 klantenservice- en binnendienstfuncties, PJM bundelt 15 leidinggevende functies (sectormanagers, teamleiders, directeur, inspanningsleiders). Het zijn dus geen twee individuele medewerkers met een extreem urenbeslag; de opbouw per functie staat in de tabel hierboven en is reproduceerbaar uit het bronbestand. Inleen (F55–F65) is bewust leeg: alle externe inzet is als out-of-pocket geraamd en staat op de onkostenposten.</w:t>
       </w:r>
     </w:p>
     <w:p>
@@ -4279,7 +3962,7 @@
           <w:bCs/>
           <w:color w:val="003366"/>
         </w:rPr>
-        <w:t xml:space="preserve">Tariefverschil model vs. Cito-sjabloon</w:t>
+        <w:t xml:space="preserve">Tariefverschil programma-raming vs. Cito-sjabloon</w:t>
       </w:r>
     </w:p>
     <w:p>
@@ -4293,7 +3976,7 @@
           <w:sz w:val="22"/>
           <w:szCs w:val="22"/>
         </w:rPr>
-        <w:t xml:space="preserve">Het programmamodel waardeert de 2027-uren tegen een geïndexeerd vlak tarief (€ 77/u; leidinggevenden € 82/u): </w:t>
+        <w:t xml:space="preserve">De programma-raming waardeert de 2027-uren tegen een geïndexeerd vlak tarief (€ 77/u; leidinggevenden € 82/u): </w:t>
       </w:r>
       <w:r>
         <w:rPr>
@@ -4333,7 +4016,7 @@
           <w:sz w:val="22"/>
           <w:szCs w:val="22"/>
         </w:rPr>
-        <w:t xml:space="preserve">. Verschil −€ 5.669 (−2,1%): het grootste urenblok (klantenservice/binnendienst, € 56/u) kost werkelijk minder dan het vlakke modeltarief; de duurdere rollen compenseren dat grotendeels. Het urenaantal (3.484) is in beide gelijk — alleen de waardering verschilt. Zodra de tariefkaart boekjaar 2027 is geladen en de tariefjaar-cel wordt bijgezet, herrekent de begroting automatisch naar 2027-tarieven (bij ± 5% indexatie → ± € 274.000).</w:t>
+        <w:t xml:space="preserve">. Verschil −€ 5.669 (−2,1%): het grootste urenblok (klantenservice/binnendienst, € 56/u) kost werkelijk minder dan het vlakke programmatarief; de duurdere rollen compenseren dat grotendeels. Het urenaantal (3.484) is in beide gelijk — alleen de waardering verschilt. Zodra de tariefkaart boekjaar 2027 is geladen en de tariefjaar-cel wordt bijgezet, herrekent de begroting automatisch naar 2027-tarieven (bij ± 5% indexatie → ± € 274.000).</w:t>
       </w:r>
     </w:p>
     <w:p>
@@ -5046,6 +4729,41 @@
           <w:szCs w:val="22"/>
         </w:rPr>
         <w:t xml:space="preserve">Controlecel F108 staat op −1: bestaande sjabloonafwijking (omzetregel telt niet mee in het aantal-totaal), aanwezig vóór het invullen.</w:t>
+      </w:r>
+    </w:p>
+    <w:p>
+      <w:pPr>
+        <w:spacing w:after="60" w:line="276"/>
+        <w:ind w:left="340" w:hanging="200"/>
+      </w:pPr>
+      <w:r>
+        <w:rPr>
+          <w:rFonts w:ascii="Calibri" w:cs="Calibri" w:eastAsia="Calibri" w:hAnsi="Calibri"/>
+          <w:color w:val="003366"/>
+          <w:sz w:val="22"/>
+          <w:szCs w:val="22"/>
+        </w:rPr>
+        <w:t xml:space="preserve">•  </w:t>
+      </w:r>
+      <w:r>
+        <w:rPr>
+          <w:rFonts w:ascii="Calibri" w:cs="Calibri" w:eastAsia="Calibri" w:hAnsi="Calibri"/>
+          <w:b/>
+          <w:bCs/>
+          <w:color w:val="1F2937"/>
+          <w:sz w:val="22"/>
+          <w:szCs w:val="22"/>
+        </w:rPr>
+        <w:t xml:space="preserve">3sides-urenraming 2027 nog te ontvangen</w:t>
+      </w:r>
+      <w:r>
+        <w:rPr>
+          <w:rFonts w:ascii="Calibri" w:cs="Calibri" w:eastAsia="Calibri" w:hAnsi="Calibri"/>
+          <w:color w:val="1F2937"/>
+          <w:sz w:val="22"/>
+          <w:szCs w:val="22"/>
+        </w:rPr>
+        <w:t xml:space="preserve"> en af te zetten tegen het begeleidingskader op post 410 (€ 58.000 begeleiding + € 7.000 onvoorzien).</w:t>
       </w:r>
     </w:p>
     <w:p>

</xml_diff>

<commit_message>
docs(begroting): disclaimer 3sides verdisconteerd in posten 410 en 543 (advies en implementatie)
</commit_message>
<xml_diff>
--- a/Begroting/Toelichting begroting 2027 - Klant in zicht.docx
+++ b/Begroting/Toelichting begroting 2027 - Klant in zicht.docx
@@ -1593,27 +1593,7 @@
           <w:sz w:val="22"/>
           <w:szCs w:val="22"/>
         </w:rPr>
-        <w:t xml:space="preserve">leiderschapsprogramma outside-in € 30.000 (externe begeleider, coaching 9 leidinggevenden, leerkringen), uniforme klantinformatieprocessen € 28.000 (externe procesbegeleiding, werksessies, pilots in Smartprocess) en de programma-brede post onvoorzien € 7.000. Het sjabloon kent geen aparte post onvoorzien; de buffer staat bij 410 omdat de belangrijkste risico’s in de externe advies-/implementatiesfeer liggen. Bij vrijval valt dit bedrag terug aan het programmabudget. </w:t>
-      </w:r>
-      <w:r>
-        <w:rPr>
-          <w:rFonts w:ascii="Calibri" w:cs="Calibri" w:eastAsia="Calibri" w:hAnsi="Calibri"/>
-          <w:b/>
-          <w:bCs/>
-          <w:color w:val="1F2937"/>
-          <w:sz w:val="22"/>
-          <w:szCs w:val="22"/>
-        </w:rPr>
-        <w:t xml:space="preserve">Op deze post landt ook de rol van 3sides</w:t>
-      </w:r>
-      <w:r>
-        <w:rPr>
-          <w:rFonts w:ascii="Calibri" w:cs="Calibri" w:eastAsia="Calibri" w:hAnsi="Calibri"/>
-          <w:color w:val="1F2937"/>
-          <w:sz w:val="22"/>
-          <w:szCs w:val="22"/>
-        </w:rPr>
-        <w:t xml:space="preserve"> als strategische- en executiepartner (begeleiding, borging, regie op met name processen en data): de begeleidingscomponenten hierboven vormen daarvoor het kader. De definitieve 3sides-urenraming 2027 (6 maanden, uren aanpasbaar op basis van de 2026-ervaring) volgt als offerte; valt die hoger uit dan het kader, dan is de post onvoorzien het eerste vangnet en vraagt het meerdere om herijking van de programmaraming.</w:t>
+        <w:t xml:space="preserve">leiderschapsprogramma outside-in € 30.000 (externe begeleider, coaching 9 leidinggevenden, leerkringen), uniforme klantinformatieprocessen € 28.000 (externe procesbegeleiding, werksessies, pilots in Smartprocess) en de programma-brede post onvoorzien € 7.000. Het sjabloon kent geen aparte post onvoorzien; de buffer staat bij 410 omdat de belangrijkste risico’s in de externe advies-/implementatiesfeer liggen. Bij vrijval valt dit bedrag terug aan het programmabudget.</w:t>
       </w:r>
     </w:p>
     <w:p>
@@ -1684,6 +1664,50 @@
           <w:szCs w:val="22"/>
         </w:rPr>
         <w:t xml:space="preserve">kostenproject (projectgroep Kosten, kostenplaats 7040); er wordt geen omzet op dit project begroot. De marge-regel toont daardoor #DIV/0! — inherent aan een kostenproject, geen fout.</w:t>
+      </w:r>
+    </w:p>
+    <w:p>
+      <w:pPr>
+        <w:spacing w:after="20" w:line="276"/>
+      </w:pPr>
+      <w:r>
+        <w:rPr>
+          <w:rFonts w:ascii="Calibri" w:cs="Calibri" w:eastAsia="Calibri" w:hAnsi="Calibri"/>
+          <w:color w:val="1F2937"/>
+          <w:sz w:val="22"/>
+          <w:szCs w:val="22"/>
+        </w:rPr>
+        <w:t xml:space="preserve"/>
+      </w:r>
+    </w:p>
+    <w:p>
+      <w:pPr>
+        <w:pBdr>
+          <w:left w:val="single" w:color="003366" w:sz="12" w:space="4"/>
+        </w:pBdr>
+        <w:shd w:fill="E8EDF3" w:val="clear"/>
+        <w:spacing w:after="160" w:line="276"/>
+        <w:ind w:left="120" w:right="120"/>
+      </w:pPr>
+      <w:r>
+        <w:rPr>
+          <w:rFonts w:ascii="Calibri" w:cs="Calibri" w:eastAsia="Calibri" w:hAnsi="Calibri"/>
+          <w:b/>
+          <w:bCs/>
+          <w:color w:val="1F2937"/>
+          <w:sz w:val="22"/>
+          <w:szCs w:val="22"/>
+        </w:rPr>
+        <w:t xml:space="preserve">Disclaimer 3sides: </w:t>
+      </w:r>
+      <w:r>
+        <w:rPr>
+          <w:rFonts w:ascii="Calibri" w:cs="Calibri" w:eastAsia="Calibri" w:hAnsi="Calibri"/>
+          <w:color w:val="1F2937"/>
+          <w:sz w:val="22"/>
+          <w:szCs w:val="22"/>
+        </w:rPr>
+        <w:t xml:space="preserve">de inzet van 3sides is verdisconteerd in de posten 410 én 543. Als strategische- en executiepartner levert 3sides zowel advies en begeleiding (410: leiderschaps- en procescomponenten) als uitvoerend werk op data &amp; systemen binnen de CRM-realisatie (543, naast de technische implementatiepartner). De precieze verdeling over beide posten volgt uit de 3sides-urenraming 2027 (6 maanden, uren aanpasbaar op basis van de 2026-ervaring); de totaalbedragen per post wijzigen daardoor niet.</w:t>
       </w:r>
     </w:p>
     <w:p>
@@ -4763,7 +4787,7 @@
           <w:sz w:val="22"/>
           <w:szCs w:val="22"/>
         </w:rPr>
-        <w:t xml:space="preserve"> en af te zetten tegen het begeleidingskader op post 410 (€ 58.000 begeleiding + € 7.000 onvoorzien).</w:t>
+        <w:t xml:space="preserve">; de verdeling van de 3sides-inzet over de posten 410 en 543 daarop afstemmen (zie disclaimer in hoofdstuk 2).</w:t>
       </w:r>
     </w:p>
     <w:p>

</xml_diff>

<commit_message>
docs(begroting): eindcontrole-fixes - plafondtolerantie uitgelegd, urenbelasting per persoon uit tabel, tariefbereik verduidelijkt, RvB gesynchroniseerd
</commit_message>
<xml_diff>
--- a/Begroting/Toelichting begroting 2027 - Klant in zicht.docx
+++ b/Begroting/Toelichting begroting 2027 - Klant in zicht.docx
@@ -520,7 +520,7 @@
           <w:sz w:val="22"/>
           <w:szCs w:val="22"/>
         </w:rPr>
-        <w:t xml:space="preserve"> van het programma Klant in Beeld, volgens het gekozen 20%-scenario (jaarplafond € 300.000 vanaf 2027). Van het vijfjarige programma (2026–2030) is hier uitsluitend het jaar 2027 opgenomen: € 301.500 externe kosten en 3.484 interne uren.</w:t>
+        <w:t xml:space="preserve"> van het programma Klant in Beeld, volgens het gekozen 20%-scenario ("Plus20": het geadviseerde vijfjarige middenscenario met een jaarbudget 20% boven het huidige plafond — totaal € 1.459.500 externe kosten over 2026–2030). Van dat programma is hier uitsluitend het jaar 2027 opgenomen: € 301.500 externe kosten en 3.484 interne uren. Het jaarbedrag ligt € 1.500 (0,5%) boven het richtbedrag van € 300.000; dat valt binnen de afrondingstolerantie van het scenario.</w:t>
       </w:r>
     </w:p>
     <w:p>
@@ -534,7 +534,7 @@
           <w:sz w:val="22"/>
           <w:szCs w:val="22"/>
         </w:rPr>
-        <w:t xml:space="preserve">Alle waarden zijn één-op-één herleid uit de actuele programmadata (stand 9 juli 2026; lokale kopie: BRON-LIVE-SESSIE-STAP4-2026-08-11.json). Tarieven en bedragen zijn onderbouwd met marktbenchmarks (o.a. Berenschot, Microsoft Pricing, Gartner).</w:t>
+        <w:t xml:space="preserve">Alle waarden zijn één-op-één herleid uit de actuele programmadata (extract d.d. 11-08-2026 van de live sessie, laatst gewijzigd 9 juli 2026; lokale kopie: BRON-LIVE-SESSIE-STAP4-2026-08-11.json). Tarieven en bedragen zijn onderbouwd met marktbenchmarks (o.a. Berenschot, Microsoft Pricing, Gartner).</w:t>
       </w:r>
     </w:p>
     <w:p>
@@ -1593,7 +1593,7 @@
           <w:sz w:val="22"/>
           <w:szCs w:val="22"/>
         </w:rPr>
-        <w:t xml:space="preserve">leiderschapsprogramma outside-in € 30.000 (externe begeleider, coaching 9 leidinggevenden, leerkringen), uniforme klantinformatieprocessen € 28.000 (externe procesbegeleiding, werksessies, pilots in Smartprocess) en de programma-brede post onvoorzien € 7.000. Het sjabloon kent geen aparte post onvoorzien; de buffer staat bij 410 omdat de belangrijkste risico’s in de externe advies-/implementatiesfeer liggen. Bij vrijval valt dit bedrag terug aan het programmabudget.</w:t>
+        <w:t xml:space="preserve">leiderschapsprogramma outside-in € 30.000 (externe begeleider, coaching 9 leidinggevenden, leerkringen), uniforme klantinformatieprocessen € 28.000 (externe procesbegeleiding, werksessies, pilots in Smartprocess — de bestaande procestool) en de programma-brede post onvoorzien € 7.000. Het sjabloon kent geen aparte post onvoorzien; de buffer staat bij 410 omdat de belangrijkste risico’s in de externe advies-/implementatiesfeer liggen. Bij vrijval valt dit bedrag terug aan het programmabudget.</w:t>
       </w:r>
     </w:p>
     <w:p>
@@ -3746,7 +3746,7 @@
           <w:sz w:val="22"/>
           <w:szCs w:val="22"/>
         </w:rPr>
-        <w:t xml:space="preserve">MCB (1.050 u) en PJM (1.030 u) zijn optellingen van meerdere functies — MCB bundelt 8 klantenservice- en binnendienstfuncties, PJM bundelt 15 leidinggevende functies (sectormanagers, teamleiders, directeur, inspanningsleiders). Het zijn dus geen twee individuele medewerkers met een extreem urenbeslag; de opbouw per functie staat in de tabel hierboven en is reproduceerbaar uit het bronbestand. Inleen (F55–F65) is bewust leeg: alle externe inzet is als out-of-pocket geraamd en staat op de onkostenposten.</w:t>
+        <w:t xml:space="preserve">MCB (1.050 u) en PJM (1.030 u) zijn optellingen van meerdere functies — MCB bundelt 8 klantenservice- en binnendienstfuncties, PJM bundelt 15 leidinggevende functies (sectormanagers, teamleiders, directeur, inspanningsleiders). Het zijn dus geen twee individuele medewerkers met een extreem urenbeslag; de opbouw staat gegroepeerd in de tabel hierboven en is per functie reproduceerbaar uit het bronbestand. Inleen (F55–F65) is bewust leeg: alle externe inzet is als out-of-pocket geraamd en staat op de onkostenposten.</w:t>
       </w:r>
     </w:p>
     <w:p>
@@ -3936,7 +3936,7 @@
           <w:sz w:val="22"/>
           <w:szCs w:val="22"/>
         </w:rPr>
-        <w:t xml:space="preserve">de uren zijn verspreid over ± 65 rollen; gemiddeld 5–12 uur per medewerker per jaar. Grootste individuele posten: inspanningsleiders 95 u (± 0,05 fte) en trainingsdeelnemers 24 u p.p.</w:t>
+        <w:t xml:space="preserve">de uren zijn verspreid over ± 65 functies door grote delen van de organisatie. Voor de meeste betrokkenen gaat het om trainingsdeelname (24 u per jaar) of korte consultatie (3–14 u); kernteamleden zitten op 40–55 u en de grootste individuele posten liggen rond de 100 u (project- en procesmanagement, sectormanagers, inspanningsleiders — ± 0,05 fte).</w:t>
       </w:r>
     </w:p>
     <w:p>
@@ -3962,7 +3962,7 @@
           <w:sz w:val="22"/>
           <w:szCs w:val="22"/>
         </w:rPr>
-        <w:t xml:space="preserve">Ten opzichte van de reguliere projecturenruimte (540 u/jaar) </w:t>
+        <w:t xml:space="preserve">Ten opzichte van de basis-urenruimte die het scenario hanteert (540 u/jaar) </w:t>
       </w:r>
       <w:r>
         <w:rPr>
@@ -4020,7 +4020,7 @@
           <w:sz w:val="22"/>
           <w:szCs w:val="22"/>
         </w:rPr>
-        <w:t xml:space="preserve">. Het Cito-sjabloon rekent met kostprijstarieven per rol uit boekjaar 2026 (€ 46–95/u): </w:t>
+        <w:t xml:space="preserve">. Het Cito-sjabloon rekent met kostprijstarieven per rol uit boekjaar 2026 (sjabloonbereik € 46–95/u; in deze begroting gebruikte codes € 56–95/u): </w:t>
       </w:r>
       <w:r>
         <w:rPr>

</xml_diff>

<commit_message>
docs(begroting): ronde-2 fixes (293u, opbouw cultuur, 3sides-herkomst), RvB compact zonder vraagtriggers, gebruikerstekst H1 behouden, bronbestanden gecommit
</commit_message>
<xml_diff>
--- a/Begroting/Toelichting begroting 2027 - Klant in zicht.docx
+++ b/Begroting/Toelichting begroting 2027 - Klant in zicht.docx
@@ -520,7 +520,7 @@
           <w:sz w:val="22"/>
           <w:szCs w:val="22"/>
         </w:rPr>
-        <w:t xml:space="preserve"> van het programma Klant in Beeld, volgens het gekozen 20%-scenario ("Plus20": het geadviseerde vijfjarige middenscenario met een jaarbudget 20% boven het huidige plafond — totaal € 1.459.500 externe kosten over 2026–2030). Van dat programma is hier uitsluitend het jaar 2027 opgenomen: € 301.500 externe kosten en 3.484 interne uren. Het jaarbedrag ligt € 1.500 (0,5%) boven het richtbedrag van € 300.000; dat valt binnen de afrondingstolerantie van het scenario.</w:t>
+        <w:t xml:space="preserve"> van het programma Klant in Beeld, volgens het gekozen 20%-scenario. Van dat programma is hier uitsluitend het jaar 2027 opgenomen: € 301.500 externe kosten en 3.484 interne uren. Het jaarbedrag ligt € 1.500 (0,5%) boven het richtbedrag van € 300.000; dat valt binnen de afrondingstolerantie van het scenario.</w:t>
       </w:r>
     </w:p>
     <w:p>
@@ -534,7 +534,7 @@
           <w:sz w:val="22"/>
           <w:szCs w:val="22"/>
         </w:rPr>
-        <w:t xml:space="preserve">Alle waarden zijn één-op-één herleid uit de actuele programmadata (extract d.d. 11-08-2026 van de live sessie, laatst gewijzigd 9 juli 2026; lokale kopie: BRON-LIVE-SESSIE-STAP4-2026-08-11.json). Tarieven en bedragen zijn onderbouwd met marktbenchmarks (o.a. Berenschot, Microsoft Pricing, Gartner).</w:t>
+        <w:t xml:space="preserve">Alle waarden zijn één-op-één herleid uit de actuele programmadata. Tarieven en bedragen zijn onderbouwd met marktbenchmarks (o.a. Berenschot, Microsoft Pricing, Gartner).</w:t>
       </w:r>
     </w:p>
     <w:p>
@@ -958,7 +958,7 @@
                 <w:sz w:val="20"/>
                 <w:szCs w:val="20"/>
               </w:rPr>
-              <w:t xml:space="preserve">Leiderschap € 30.000 + processen € 28.000 + onvoorzien € 7.000</w:t>
+              <w:t xml:space="preserve">Leiderschap € 30.000 + processen € 28.000 + onvoorzien € 7.000 — begeleiding door o.a. 3sides</w:t>
             </w:r>
           </w:p>
         </w:tc>
@@ -1084,7 +1084,7 @@
                 <w:sz w:val="20"/>
                 <w:szCs w:val="20"/>
               </w:rPr>
-              <w:t xml:space="preserve">CRM: implementatiepartner + beheer (€ 197.000 − licenties)</w:t>
+              <w:t xml:space="preserve">CRM: implementatiepartner + beheer (€ 197.000 − licenties) — uitvoering deels door 3sides</w:t>
             </w:r>
           </w:p>
         </w:tc>
@@ -1558,7 +1558,7 @@
           <w:sz w:val="22"/>
           <w:szCs w:val="22"/>
         </w:rPr>
-        <w:t xml:space="preserve">het restant van het CRM-jaarbedrag: de externe implementatiepartner bouwt datamodel en koppelingen, realiseert de eerste bronsysteemintegraties (4 van 7–8), migreert data en richt de sectoren PO en VO in; daarnaast beheer en doorontwikkeling. Ingekochte ICT-dienstverlening → post 543.</w:t>
+        <w:t xml:space="preserve">het restant van het CRM-jaarbedrag: de externe implementatiepartner bouwt datamodel en koppelingen, realiseert de eerste bronsysteemintegraties (4 van 7–8), migreert data en richt de sectoren PO en VO in; daarnaast beheer en doorontwikkeling. Een deel van dit uitvoerende data &amp; systemen-werk wordt door 3sides geleverd (zie disclaimer). Ingekochte ICT-dienstverlening → post 543.</w:t>
       </w:r>
     </w:p>
     <w:p>
@@ -1593,7 +1593,7 @@
           <w:sz w:val="22"/>
           <w:szCs w:val="22"/>
         </w:rPr>
-        <w:t xml:space="preserve">leiderschapsprogramma outside-in € 30.000 (externe begeleider, coaching 9 leidinggevenden, leerkringen), uniforme klantinformatieprocessen € 28.000 (externe procesbegeleiding, werksessies, pilots in Smartprocess — de bestaande procestool) en de programma-brede post onvoorzien € 7.000. Het sjabloon kent geen aparte post onvoorzien; de buffer staat bij 410 omdat de belangrijkste risico’s in de externe advies-/implementatiesfeer liggen. Bij vrijval valt dit bedrag terug aan het programmabudget.</w:t>
+        <w:t xml:space="preserve">leiderschapsprogramma outside-in € 30.000 (externe begeleider, coaching 9 leidinggevenden, leerkringen), uniforme klantinformatieprocessen € 28.000 (externe procesbegeleiding, werksessies, pilots in Smartprocess — de bestaande procestool) en de programma-brede post onvoorzien € 7.000. De begeleiding wordt mede door 3sides geleverd (zie disclaimer). Het sjabloon kent geen aparte post onvoorzien; de buffer staat bij 410 omdat de belangrijkste risico’s in de externe advies-/implementatiesfeer liggen. Bij vrijval valt dit bedrag terug aan het programmabudget.</w:t>
       </w:r>
     </w:p>
     <w:p>
@@ -1876,7 +1876,7 @@
           <w:sz w:val="22"/>
           <w:szCs w:val="22"/>
         </w:rPr>
-        <w:t xml:space="preserve">. Dit is het Cito-tarief dat het dichtst ligt bij wat het programma voor leidinggevenden rekende (€ 82/u).</w:t>
+        <w:t xml:space="preserve">. PJM is de enige leidinggevende rolcode in het sjabloon; het tarief ligt daarmee het dichtst bij de € 82/u die het programma voor leidinggevenden rekent.</w:t>
       </w:r>
     </w:p>
     <w:p>
@@ -3796,7 +3796,7 @@
           <w:sz w:val="22"/>
           <w:szCs w:val="22"/>
         </w:rPr>
-        <w:t xml:space="preserve">Het vijfjarige scenario kent 8.166 uur; 2026 is aanloop (330 u), 2027 en 2028 zijn de uitvoeringsjaren, daarna zakt het sterk terug. In 2027 vallen twee zware sporen samen: het eerste trainingsblok én het CRM-realisatiejaar.</w:t>
+        <w:t xml:space="preserve">Het vijfjarige scenario kent 8.166 uur; 2026 is aanloop (293 u), 2027 en 2028 zijn de uitvoeringsjaren, daarna zakt het sterk terug. In 2027 vallen twee zware sporen samen: het eerste trainingsblok én het CRM-realisatiejaar.</w:t>
       </w:r>
     </w:p>
     <w:p>
@@ -3901,7 +3901,7 @@
           <w:sz w:val="22"/>
           <w:szCs w:val="22"/>
         </w:rPr>
-        <w:t xml:space="preserve">Leiderschapsprogramma (9 leidinggevenden × ± 41 u deelname) plus HR-instrumentarium, en de werkgroep procesherontwerp met pilots per sector.</w:t>
+        <w:t xml:space="preserve">Leiderschapsprogramma (deelname 7 leidinggevenden × 41 u + inspanningsleider 95 u + HR-instrumentarium 82 u = 464 u) en de werkgroep procesherontwerp met pilots per sector.</w:t>
       </w:r>
     </w:p>
     <w:p>
@@ -3936,7 +3936,7 @@
           <w:sz w:val="22"/>
           <w:szCs w:val="22"/>
         </w:rPr>
-        <w:t xml:space="preserve">de uren zijn verspreid over ± 65 functies door grote delen van de organisatie. Voor de meeste betrokkenen gaat het om trainingsdeelname (24 u per jaar) of korte consultatie (3–14 u); kernteamleden zitten op 40–55 u en de grootste individuele posten liggen rond de 100 u (project- en procesmanagement, sectormanagers, inspanningsleiders — ± 0,05 fte).</w:t>
+        <w:t xml:space="preserve">de uren zijn verspreid over ± 65 functies door grote delen van de organisatie. Voor de meeste betrokkenen gaat het om trainingsdeelname (24 u per jaar) of korte consultatie (3–14 u); kernteamleden zitten op 40–55 u (HR-instrumentarium 82 u) en de grootste individuele posten liggen rond de 100 u (project- en procesmanagement, sectormanagers, inspanningsleiders — ± 0,05 fte).</w:t>
       </w:r>
     </w:p>
     <w:p>
@@ -4000,7 +4000,7 @@
           <w:sz w:val="22"/>
           <w:szCs w:val="22"/>
         </w:rPr>
-        <w:t xml:space="preserve">De programma-raming waardeert de 2027-uren tegen een geïndexeerd vlak tarief (€ 77/u; leidinggevenden € 82/u): </w:t>
+        <w:t xml:space="preserve">De programma-raming waardeert de 2027-uren tegen een geïndexeerd vlak tarief (overwegend € 77/u, leidinggevenden deels € 82/u): </w:t>
       </w:r>
       <w:r>
         <w:rPr>
@@ -4020,7 +4020,7 @@
           <w:sz w:val="22"/>
           <w:szCs w:val="22"/>
         </w:rPr>
-        <w:t xml:space="preserve">. Het Cito-sjabloon rekent met kostprijstarieven per rol uit boekjaar 2026 (sjabloonbereik € 46–95/u; in deze begroting gebruikte codes € 56–95/u): </w:t>
+        <w:t xml:space="preserve">. Het Cito-sjabloon rekent met kostprijstarieven per rol uit boekjaar 2026 (sjabloonbereik interne rollen € 46–95/u, externe rolcode ICTE € 139/u; in deze begroting gebruikte codes € 56–95/u): </w:t>
       </w:r>
       <w:r>
         <w:rPr>
@@ -4728,7 +4728,7 @@
           <w:sz w:val="22"/>
           <w:szCs w:val="22"/>
         </w:rPr>
-        <w:t xml:space="preserve">Tabblad Stamgegevens bevat drie verouderde hardgecodeerde persnummers (vertaling PL/controller/verkoper) — bewust niet aangepast; administratie-eigenaarschap ligt bij control.</w:t>
+        <w:t xml:space="preserve">Tabblad Stamgegevens bevat drie verouderde hardgecodeerde persnummers (projectleider, controller en verkoopleider) — bewust niet aangepast; administratie-eigenaarschap ligt bij control.</w:t>
       </w:r>
     </w:p>
     <w:p>

</xml_diff>